<commit_message>
RDA:lab4 and 3 minor fixes. lab5 starte
</commit_message>
<xml_diff>
--- a/RDA/Labs/lab3/Отчёт.docx
+++ b/RDA/Labs/lab3/Отчёт.docx
@@ -41,7 +41,27 @@
           <w:sz w:val="28"/>
           <w:szCs w:val="28"/>
         </w:rPr>
-        <w:t>Тема: «Система управления проектами»</w:t>
+        <w:t xml:space="preserve">Тема: </w:t>
+      </w:r>
+      <w:r>
+        <w:rPr>
+          <w:rFonts w:ascii="Times New Roman" w:hAnsi="Times New Roman" w:cs="Times New Roman"/>
+          <w:b/>
+          <w:bCs/>
+          <w:sz w:val="28"/>
+          <w:szCs w:val="28"/>
+        </w:rPr>
+        <w:t xml:space="preserve">Программное средство </w:t>
+      </w:r>
+      <w:r>
+        <w:rPr>
+          <w:rFonts w:ascii="Times New Roman" w:hAnsi="Times New Roman" w:cs="Times New Roman"/>
+          <w:b/>
+          <w:bCs/>
+          <w:sz w:val="28"/>
+          <w:szCs w:val="28"/>
+        </w:rPr>
+        <w:t>«Система управления проектами»</w:t>
       </w:r>
     </w:p>
     <w:p>
@@ -342,7 +362,25 @@
                 <w:sz w:val="28"/>
                 <w:szCs w:val="28"/>
               </w:rPr>
-              <w:t xml:space="preserve">Пользователь должен быть разлогинен из системы через 10 минут после бездействия за исключением случаев активного  редактирования </w:t>
+              <w:t xml:space="preserve">Пользователь должен быть </w:t>
+            </w:r>
+            <w:proofErr w:type="spellStart"/>
+            <w:r>
+              <w:rPr>
+                <w:rFonts w:ascii="Times New Roman" w:hAnsi="Times New Roman" w:cs="Times New Roman"/>
+                <w:sz w:val="28"/>
+                <w:szCs w:val="28"/>
+              </w:rPr>
+              <w:t>разлогинен</w:t>
+            </w:r>
+            <w:proofErr w:type="spellEnd"/>
+            <w:r>
+              <w:rPr>
+                <w:rFonts w:ascii="Times New Roman" w:hAnsi="Times New Roman" w:cs="Times New Roman"/>
+                <w:sz w:val="28"/>
+                <w:szCs w:val="28"/>
+              </w:rPr>
+              <w:t xml:space="preserve"> из системы через 10 минут после бездействия за исключением случаев активного  редактирования </w:t>
             </w:r>
             <w:r>
               <w:rPr>

</xml_diff>